<commit_message>
Perbaiki v4 Bab 2.3: kategori A sampai D dengan penjelasan, kolom Guru diundang
Co-Authored-By: Claude Sonnet 5.5 <noreply@anthropic.com>
</commit_message>
<xml_diff>
--- a/slb-kaltim/bagian-sasaran/v4 Pengganti Bab 2.3 Peserta dan Sekolah Sasaran - SLB dan Inklusif Balikpapan.docx
+++ b/slb-kaltim/bagian-sasaran/v4 Pengganti Bab 2.3 Peserta dan Sekolah Sasaran - SLB dan Inklusif Balikpapan.docx
@@ -164,7 +164,7 @@
         <w:jc w:val="left"/>
       </w:pPr>
       <w:r>
-        <w:t xml:space="preserve">Kuota sekarang per sekolah dengan aturan yang bisa dihitung ulang, memakai data guru dan siswa nyata. SDN 010 Balikpapan Selatan dikeluarkan karena berita yang menyebutnya tidak menyebut kecamatan dan SDN 010 ada di keenam kecamatan. Penggantinya SDN 008 Balikpapan Kota. SMP Negeri 4 dan SD IT Luqman Al-Hakim ditambahkan. Delapan SMA dan SMK inklusif kini lengkap dengan alamat, kontak, guru, dan siswa.</w:t>
+        <w:t xml:space="preserve">Kuota sekarang per sekolah dengan aturan yang bisa dihitung ulang, memakai data guru dan siswa nyata. Kategori kini bernama A sampai D dengan penjelasan di 2.3.1, dan kolom Kuota di tabel sekolah diganti Guru diundang. SDN 010 Balikpapan Selatan dikeluarkan karena berita yang menyebutnya tidak menyebut kecamatan dan SDN 010 ada di keenam kecamatan. Penggantinya SDN 008 Balikpapan Kota. SMP Negeri 4 dan SD IT Luqman Al-Hakim ditambahkan. Delapan SMA dan SMK inklusif kini lengkap dengan alamat, kontak, guru, dan siswa.</w:t>
       </w:r>
     </w:p>
     <w:p>
@@ -249,7 +249,55 @@
           <w:sz w:val="20"/>
           <w:szCs w:val="20"/>
         </w:rPr>
-        <w:t xml:space="preserve">2.3.1 Kategori sekolah sasaran dan aturan kuota</w:t>
+        <w:t xml:space="preserve">2.3.1 Kategori sekolah sasaran dan jumlah guru yang diundang</w:t>
+      </w:r>
+    </w:p>
+    <w:p>
+      <w:pPr>
+        <w:spacing w:after="110" w:before="0" w:line="290"/>
+        <w:jc w:val="left"/>
+      </w:pPr>
+      <w:r>
+        <w:t xml:space="preserve">Kami mengelompokkan sekolah sasaran ke empat kategori menurut jenis sekolah dan instansi pembinanya. </w:t>
+      </w:r>
+      <w:r>
+        <w:rPr>
+          <w:b/>
+          <w:bCs/>
+        </w:rPr>
+        <w:t xml:space="preserve">Kategori A</w:t>
+      </w:r>
+      <w:r>
+        <w:t xml:space="preserve"> adalah SLB, yaitu sekolah khusus yang seluruh muridnya berkebutuhan khusus. </w:t>
+      </w:r>
+      <w:r>
+        <w:rPr>
+          <w:b/>
+          <w:bCs/>
+        </w:rPr>
+        <w:t xml:space="preserve">Kategori B dan C</w:t>
+      </w:r>
+      <w:r>
+        <w:t xml:space="preserve"> adalah sekolah inklusif, yaitu sekolah biasa yang menerima murid berkebutuhan khusus bersama murid lain. Kategori B memuat SD dan SMP, kategori C memuat SMA dan SMK. </w:t>
+      </w:r>
+      <w:r>
+        <w:rPr>
+          <w:b/>
+          <w:bCs/>
+        </w:rPr>
+        <w:t xml:space="preserve">Kategori D</w:t>
+      </w:r>
+      <w:r>
+        <w:t xml:space="preserve"> bukan penyedia peserta. Isinya kelompok guru, komunitas orang tua, dan mitra yang membantu menyebarkan undangan.</w:t>
+      </w:r>
+    </w:p>
+    <w:p>
+      <w:pPr>
+        <w:spacing w:after="110" w:before="0" w:line="290"/>
+        <w:jc w:val="left"/>
+      </w:pPr>
+      <w:r>
+        <w:t xml:space="preserve">Kolom Guru diundang menyebut jumlah guru yang kami undang dari tiap sekolah. Angka itu sekaligus menjadi kuota peserta, dan jumlahnya 80 orang.</w:t>
       </w:r>
     </w:p>
     <w:p>
@@ -274,12 +322,13 @@
         </w:tblBorders>
       </w:tblPr>
       <w:tblGrid>
-        <w:gridCol w:w="1600"/>
-        <w:gridCol w:w="1000"/>
-        <w:gridCol w:w="1200"/>
-        <w:gridCol w:w="1100"/>
+        <w:gridCol w:w="1300"/>
+        <w:gridCol w:w="1700"/>
+        <w:gridCol w:w="800"/>
+        <w:gridCol w:w="1050"/>
+        <w:gridCol w:w="800"/>
         <w:gridCol w:w="900"/>
-        <w:gridCol w:w="3838"/>
+        <w:gridCol w:w="3088"/>
       </w:tblGrid>
       <w:tr>
         <w:trPr>
@@ -288,7 +337,7 @@
         </w:trPr>
         <w:tc>
           <w:tcPr>
-            <w:tcW w:type="dxa" w:w="1600"/>
+            <w:tcW w:type="dxa" w:w="1300"/>
             <w:tcBorders>
               <w:top w:val="single" w:color="C9D2DE" w:sz="4"/>
               <w:left w:val="single" w:color="C9D2DE" w:sz="4"/>
@@ -323,7 +372,7 @@
         </w:tc>
         <w:tc>
           <w:tcPr>
-            <w:tcW w:type="dxa" w:w="1000"/>
+            <w:tcW w:type="dxa" w:w="1700"/>
             <w:tcBorders>
               <w:top w:val="single" w:color="C9D2DE" w:sz="4"/>
               <w:left w:val="single" w:color="C9D2DE" w:sz="4"/>
@@ -352,13 +401,13 @@
                 <w:sz w:val="16"/>
                 <w:szCs w:val="16"/>
               </w:rPr>
-              <w:t xml:space="preserve">Sekolah</w:t>
-            </w:r>
-          </w:p>
-        </w:tc>
-        <w:tc>
-          <w:tcPr>
-            <w:tcW w:type="dxa" w:w="1200"/>
+              <w:t xml:space="preserve">Jenis sekolah</w:t>
+            </w:r>
+          </w:p>
+        </w:tc>
+        <w:tc>
+          <w:tcPr>
+            <w:tcW w:type="dxa" w:w="800"/>
             <w:tcBorders>
               <w:top w:val="single" w:color="C9D2DE" w:sz="4"/>
               <w:left w:val="single" w:color="C9D2DE" w:sz="4"/>
@@ -387,13 +436,13 @@
                 <w:sz w:val="16"/>
                 <w:szCs w:val="16"/>
               </w:rPr>
-              <w:t xml:space="preserve">Guru tercatat</w:t>
-            </w:r>
-          </w:p>
-        </w:tc>
-        <w:tc>
-          <w:tcPr>
-            <w:tcW w:type="dxa" w:w="1100"/>
+              <w:t xml:space="preserve">Sekolah</w:t>
+            </w:r>
+          </w:p>
+        </w:tc>
+        <w:tc>
+          <w:tcPr>
+            <w:tcW w:type="dxa" w:w="1050"/>
             <w:tcBorders>
               <w:top w:val="single" w:color="C9D2DE" w:sz="4"/>
               <w:left w:val="single" w:color="C9D2DE" w:sz="4"/>
@@ -422,13 +471,13 @@
                 <w:sz w:val="16"/>
                 <w:szCs w:val="16"/>
               </w:rPr>
-              <w:t xml:space="preserve">Siswa</w:t>
-            </w:r>
-          </w:p>
-        </w:tc>
-        <w:tc>
-          <w:tcPr>
-            <w:tcW w:type="dxa" w:w="900"/>
+              <w:t xml:space="preserve">Guru tercatat</w:t>
+            </w:r>
+          </w:p>
+        </w:tc>
+        <w:tc>
+          <w:tcPr>
+            <w:tcW w:type="dxa" w:w="800"/>
             <w:tcBorders>
               <w:top w:val="single" w:color="C9D2DE" w:sz="4"/>
               <w:left w:val="single" w:color="C9D2DE" w:sz="4"/>
@@ -457,13 +506,13 @@
                 <w:sz w:val="16"/>
                 <w:szCs w:val="16"/>
               </w:rPr>
-              <w:t xml:space="preserve">Kuota</w:t>
-            </w:r>
-          </w:p>
-        </w:tc>
-        <w:tc>
-          <w:tcPr>
-            <w:tcW w:type="dxa" w:w="3838"/>
+              <w:t xml:space="preserve">Siswa</w:t>
+            </w:r>
+          </w:p>
+        </w:tc>
+        <w:tc>
+          <w:tcPr>
+            <w:tcW w:type="dxa" w:w="900"/>
             <w:tcBorders>
               <w:top w:val="single" w:color="C9D2DE" w:sz="4"/>
               <w:left w:val="single" w:color="C9D2DE" w:sz="4"/>
@@ -482,7 +531,7 @@
           <w:p>
             <w:pPr>
               <w:spacing w:after="30" w:line="260"/>
-              <w:jc w:val="left"/>
+              <w:jc w:val="right"/>
             </w:pPr>
             <w:r>
               <w:rPr>
@@ -492,7 +541,42 @@
                 <w:sz w:val="16"/>
                 <w:szCs w:val="16"/>
               </w:rPr>
-              <w:t xml:space="preserve">Aturan penentuan kuota</w:t>
+              <w:t xml:space="preserve">Guru diundang</w:t>
+            </w:r>
+          </w:p>
+        </w:tc>
+        <w:tc>
+          <w:tcPr>
+            <w:tcW w:type="dxa" w:w="3088"/>
+            <w:tcBorders>
+              <w:top w:val="single" w:color="C9D2DE" w:sz="4"/>
+              <w:left w:val="single" w:color="C9D2DE" w:sz="4"/>
+              <w:bottom w:val="single" w:color="C9D2DE" w:sz="4"/>
+              <w:right w:val="single" w:color="C9D2DE" w:sz="4"/>
+            </w:tcBorders>
+            <w:shd w:fill="0B396D" w:color="auto" w:val="clear"/>
+            <w:tcMar>
+              <w:top w:type="dxa" w:w="70"/>
+              <w:left w:type="dxa" w:w="100"/>
+              <w:bottom w:type="dxa" w:w="70"/>
+              <w:right w:type="dxa" w:w="100"/>
+            </w:tcMar>
+            <w:vAlign w:val="top"/>
+          </w:tcPr>
+          <w:p>
+            <w:pPr>
+              <w:spacing w:after="30" w:line="260"/>
+              <w:jc w:val="left"/>
+            </w:pPr>
+            <w:r>
+              <w:rPr>
+                <w:b/>
+                <w:bCs/>
+                <w:color w:val="FFFFFF"/>
+                <w:sz w:val="16"/>
+                <w:szCs w:val="16"/>
+              </w:rPr>
+              <w:t xml:space="preserve">Aturan penentuan jumlah guru diundang</w:t>
             </w:r>
           </w:p>
         </w:tc>
@@ -503,7 +587,7 @@
         </w:trPr>
         <w:tc>
           <w:tcPr>
-            <w:tcW w:type="dxa" w:w="1600"/>
+            <w:tcW w:type="dxa" w:w="1300"/>
             <w:tcBorders>
               <w:top w:val="single" w:color="C9D2DE" w:sz="4"/>
               <w:left w:val="single" w:color="C9D2DE" w:sz="4"/>
@@ -531,31 +615,63 @@
                 <w:sz w:val="17"/>
                 <w:szCs w:val="17"/>
               </w:rPr>
-              <w:t xml:space="preserve">A dan B. SLB</w:t>
-            </w:r>
-          </w:p>
-        </w:tc>
-        <w:tc>
-          <w:tcPr>
-            <w:tcW w:type="dxa" w:w="1000"/>
-            <w:tcBorders>
-              <w:top w:val="single" w:color="C9D2DE" w:sz="4"/>
-              <w:left w:val="single" w:color="C9D2DE" w:sz="4"/>
-              <w:bottom w:val="single" w:color="C9D2DE" w:sz="4"/>
-              <w:right w:val="single" w:color="C9D2DE" w:sz="4"/>
-            </w:tcBorders>
-            <w:tcMar>
-              <w:top w:type="dxa" w:w="70"/>
-              <w:left w:type="dxa" w:w="100"/>
-              <w:bottom w:type="dxa" w:w="70"/>
-              <w:right w:type="dxa" w:w="100"/>
-            </w:tcMar>
-            <w:vAlign w:val="top"/>
-          </w:tcPr>
-          <w:p>
-            <w:pPr>
-              <w:spacing w:after="30" w:line="260"/>
-              <w:jc w:val="left"/>
+              <w:t xml:space="preserve">A. SLB</w:t>
+            </w:r>
+          </w:p>
+        </w:tc>
+        <w:tc>
+          <w:tcPr>
+            <w:tcW w:type="dxa" w:w="1700"/>
+            <w:tcBorders>
+              <w:top w:val="single" w:color="C9D2DE" w:sz="4"/>
+              <w:left w:val="single" w:color="C9D2DE" w:sz="4"/>
+              <w:bottom w:val="single" w:color="C9D2DE" w:sz="4"/>
+              <w:right w:val="single" w:color="C9D2DE" w:sz="4"/>
+            </w:tcBorders>
+            <w:tcMar>
+              <w:top w:type="dxa" w:w="70"/>
+              <w:left w:type="dxa" w:w="100"/>
+              <w:bottom w:type="dxa" w:w="70"/>
+              <w:right w:type="dxa" w:w="100"/>
+            </w:tcMar>
+            <w:vAlign w:val="top"/>
+          </w:tcPr>
+          <w:p>
+            <w:pPr>
+              <w:spacing w:after="30" w:line="260"/>
+              <w:jc w:val="left"/>
+            </w:pPr>
+            <w:r>
+              <w:rPr>
+                <w:color w:val="1D1D1F"/>
+                <w:sz w:val="17"/>
+                <w:szCs w:val="17"/>
+              </w:rPr>
+              <w:t xml:space="preserve">Sekolah khusus</w:t>
+            </w:r>
+          </w:p>
+        </w:tc>
+        <w:tc>
+          <w:tcPr>
+            <w:tcW w:type="dxa" w:w="800"/>
+            <w:tcBorders>
+              <w:top w:val="single" w:color="C9D2DE" w:sz="4"/>
+              <w:left w:val="single" w:color="C9D2DE" w:sz="4"/>
+              <w:bottom w:val="single" w:color="C9D2DE" w:sz="4"/>
+              <w:right w:val="single" w:color="C9D2DE" w:sz="4"/>
+            </w:tcBorders>
+            <w:tcMar>
+              <w:top w:type="dxa" w:w="70"/>
+              <w:left w:type="dxa" w:w="100"/>
+              <w:bottom w:type="dxa" w:w="70"/>
+              <w:right w:type="dxa" w:w="100"/>
+            </w:tcMar>
+            <w:vAlign w:val="top"/>
+          </w:tcPr>
+          <w:p>
+            <w:pPr>
+              <w:spacing w:after="30" w:line="260"/>
+              <w:jc w:val="right"/>
             </w:pPr>
             <w:r>
               <w:rPr>
@@ -569,7 +685,7 @@
         </w:tc>
         <w:tc>
           <w:tcPr>
-            <w:tcW w:type="dxa" w:w="1200"/>
+            <w:tcW w:type="dxa" w:w="1050"/>
             <w:tcBorders>
               <w:top w:val="single" w:color="C9D2DE" w:sz="4"/>
               <w:left w:val="single" w:color="C9D2DE" w:sz="4"/>
@@ -601,7 +717,7 @@
         </w:tc>
         <w:tc>
           <w:tcPr>
-            <w:tcW w:type="dxa" w:w="1100"/>
+            <w:tcW w:type="dxa" w:w="800"/>
             <w:tcBorders>
               <w:top w:val="single" w:color="C9D2DE" w:sz="4"/>
               <w:left w:val="single" w:color="C9D2DE" w:sz="4"/>
@@ -665,7 +781,7 @@
         </w:tc>
         <w:tc>
           <w:tcPr>
-            <w:tcW w:type="dxa" w:w="3838"/>
+            <w:tcW w:type="dxa" w:w="3088"/>
             <w:tcBorders>
               <w:top w:val="single" w:color="C9D2DE" w:sz="4"/>
               <w:left w:val="single" w:color="C9D2DE" w:sz="4"/>
@@ -702,7 +818,7 @@
         </w:trPr>
         <w:tc>
           <w:tcPr>
-            <w:tcW w:type="dxa" w:w="1600"/>
+            <w:tcW w:type="dxa" w:w="1300"/>
             <w:tcBorders>
               <w:top w:val="single" w:color="C9D2DE" w:sz="4"/>
               <w:left w:val="single" w:color="C9D2DE" w:sz="4"/>
@@ -731,13 +847,13 @@
                 <w:sz w:val="17"/>
                 <w:szCs w:val="17"/>
               </w:rPr>
-              <w:t xml:space="preserve">C. SD dan SMP inklusif</w:t>
-            </w:r>
-          </w:p>
-        </w:tc>
-        <w:tc>
-          <w:tcPr>
-            <w:tcW w:type="dxa" w:w="1000"/>
+              <w:t xml:space="preserve">B. SD dan SMP inklusif</w:t>
+            </w:r>
+          </w:p>
+        </w:tc>
+        <w:tc>
+          <w:tcPr>
+            <w:tcW w:type="dxa" w:w="1700"/>
             <w:tcBorders>
               <w:top w:val="single" w:color="C9D2DE" w:sz="4"/>
               <w:left w:val="single" w:color="C9D2DE" w:sz="4"/>
@@ -764,13 +880,46 @@
                 <w:sz w:val="17"/>
                 <w:szCs w:val="17"/>
               </w:rPr>
+              <w:t xml:space="preserve">Sekolah inklusif</w:t>
+            </w:r>
+          </w:p>
+        </w:tc>
+        <w:tc>
+          <w:tcPr>
+            <w:tcW w:type="dxa" w:w="800"/>
+            <w:tcBorders>
+              <w:top w:val="single" w:color="C9D2DE" w:sz="4"/>
+              <w:left w:val="single" w:color="C9D2DE" w:sz="4"/>
+              <w:bottom w:val="single" w:color="C9D2DE" w:sz="4"/>
+              <w:right w:val="single" w:color="C9D2DE" w:sz="4"/>
+            </w:tcBorders>
+            <w:shd w:fill="F7F9FC" w:color="auto" w:val="clear"/>
+            <w:tcMar>
+              <w:top w:type="dxa" w:w="70"/>
+              <w:left w:type="dxa" w:w="100"/>
+              <w:bottom w:type="dxa" w:w="70"/>
+              <w:right w:type="dxa" w:w="100"/>
+            </w:tcMar>
+            <w:vAlign w:val="top"/>
+          </w:tcPr>
+          <w:p>
+            <w:pPr>
+              <w:spacing w:after="30" w:line="260"/>
+              <w:jc w:val="right"/>
+            </w:pPr>
+            <w:r>
+              <w:rPr>
+                <w:color w:val="1D1D1F"/>
+                <w:sz w:val="17"/>
+                <w:szCs w:val="17"/>
+              </w:rPr>
               <w:t xml:space="preserve">6 kecamatan</w:t>
             </w:r>
           </w:p>
         </w:tc>
         <w:tc>
           <w:tcPr>
-            <w:tcW w:type="dxa" w:w="1200"/>
+            <w:tcW w:type="dxa" w:w="1050"/>
             <w:tcBorders>
               <w:top w:val="single" w:color="C9D2DE" w:sz="4"/>
               <w:left w:val="single" w:color="C9D2DE" w:sz="4"/>
@@ -803,7 +952,7 @@
         </w:tc>
         <w:tc>
           <w:tcPr>
-            <w:tcW w:type="dxa" w:w="1100"/>
+            <w:tcW w:type="dxa" w:w="800"/>
             <w:tcBorders>
               <w:top w:val="single" w:color="C9D2DE" w:sz="4"/>
               <w:left w:val="single" w:color="C9D2DE" w:sz="4"/>
@@ -869,7 +1018,7 @@
         </w:tc>
         <w:tc>
           <w:tcPr>
-            <w:tcW w:type="dxa" w:w="3838"/>
+            <w:tcW w:type="dxa" w:w="3088"/>
             <w:tcBorders>
               <w:top w:val="single" w:color="C9D2DE" w:sz="4"/>
               <w:left w:val="single" w:color="C9D2DE" w:sz="4"/>
@@ -907,7 +1056,7 @@
         </w:trPr>
         <w:tc>
           <w:tcPr>
-            <w:tcW w:type="dxa" w:w="1600"/>
+            <w:tcW w:type="dxa" w:w="1300"/>
             <w:tcBorders>
               <w:top w:val="single" w:color="C9D2DE" w:sz="4"/>
               <w:left w:val="single" w:color="C9D2DE" w:sz="4"/>
@@ -935,31 +1084,63 @@
                 <w:sz w:val="17"/>
                 <w:szCs w:val="17"/>
               </w:rPr>
-              <w:t xml:space="preserve">D. SMA dan SMK inklusif</w:t>
-            </w:r>
-          </w:p>
-        </w:tc>
-        <w:tc>
-          <w:tcPr>
-            <w:tcW w:type="dxa" w:w="1000"/>
-            <w:tcBorders>
-              <w:top w:val="single" w:color="C9D2DE" w:sz="4"/>
-              <w:left w:val="single" w:color="C9D2DE" w:sz="4"/>
-              <w:bottom w:val="single" w:color="C9D2DE" w:sz="4"/>
-              <w:right w:val="single" w:color="C9D2DE" w:sz="4"/>
-            </w:tcBorders>
-            <w:tcMar>
-              <w:top w:type="dxa" w:w="70"/>
-              <w:left w:type="dxa" w:w="100"/>
-              <w:bottom w:type="dxa" w:w="70"/>
-              <w:right w:type="dxa" w:w="100"/>
-            </w:tcMar>
-            <w:vAlign w:val="top"/>
-          </w:tcPr>
-          <w:p>
-            <w:pPr>
-              <w:spacing w:after="30" w:line="260"/>
-              <w:jc w:val="left"/>
+              <w:t xml:space="preserve">C. SMA dan SMK inklusif</w:t>
+            </w:r>
+          </w:p>
+        </w:tc>
+        <w:tc>
+          <w:tcPr>
+            <w:tcW w:type="dxa" w:w="1700"/>
+            <w:tcBorders>
+              <w:top w:val="single" w:color="C9D2DE" w:sz="4"/>
+              <w:left w:val="single" w:color="C9D2DE" w:sz="4"/>
+              <w:bottom w:val="single" w:color="C9D2DE" w:sz="4"/>
+              <w:right w:val="single" w:color="C9D2DE" w:sz="4"/>
+            </w:tcBorders>
+            <w:tcMar>
+              <w:top w:type="dxa" w:w="70"/>
+              <w:left w:type="dxa" w:w="100"/>
+              <w:bottom w:type="dxa" w:w="70"/>
+              <w:right w:type="dxa" w:w="100"/>
+            </w:tcMar>
+            <w:vAlign w:val="top"/>
+          </w:tcPr>
+          <w:p>
+            <w:pPr>
+              <w:spacing w:after="30" w:line="260"/>
+              <w:jc w:val="left"/>
+            </w:pPr>
+            <w:r>
+              <w:rPr>
+                <w:color w:val="1D1D1F"/>
+                <w:sz w:val="17"/>
+                <w:szCs w:val="17"/>
+              </w:rPr>
+              <w:t xml:space="preserve">Sekolah inklusif</w:t>
+            </w:r>
+          </w:p>
+        </w:tc>
+        <w:tc>
+          <w:tcPr>
+            <w:tcW w:type="dxa" w:w="800"/>
+            <w:tcBorders>
+              <w:top w:val="single" w:color="C9D2DE" w:sz="4"/>
+              <w:left w:val="single" w:color="C9D2DE" w:sz="4"/>
+              <w:bottom w:val="single" w:color="C9D2DE" w:sz="4"/>
+              <w:right w:val="single" w:color="C9D2DE" w:sz="4"/>
+            </w:tcBorders>
+            <w:tcMar>
+              <w:top w:type="dxa" w:w="70"/>
+              <w:left w:type="dxa" w:w="100"/>
+              <w:bottom w:type="dxa" w:w="70"/>
+              <w:right w:type="dxa" w:w="100"/>
+            </w:tcMar>
+            <w:vAlign w:val="top"/>
+          </w:tcPr>
+          <w:p>
+            <w:pPr>
+              <w:spacing w:after="30" w:line="260"/>
+              <w:jc w:val="right"/>
             </w:pPr>
             <w:r>
               <w:rPr>
@@ -973,7 +1154,7 @@
         </w:tc>
         <w:tc>
           <w:tcPr>
-            <w:tcW w:type="dxa" w:w="1200"/>
+            <w:tcW w:type="dxa" w:w="1050"/>
             <w:tcBorders>
               <w:top w:val="single" w:color="C9D2DE" w:sz="4"/>
               <w:left w:val="single" w:color="C9D2DE" w:sz="4"/>
@@ -1005,7 +1186,7 @@
         </w:tc>
         <w:tc>
           <w:tcPr>
-            <w:tcW w:type="dxa" w:w="1100"/>
+            <w:tcW w:type="dxa" w:w="800"/>
             <w:tcBorders>
               <w:top w:val="single" w:color="C9D2DE" w:sz="4"/>
               <w:left w:val="single" w:color="C9D2DE" w:sz="4"/>
@@ -1069,7 +1250,7 @@
         </w:tc>
         <w:tc>
           <w:tcPr>
-            <w:tcW w:type="dxa" w:w="3838"/>
+            <w:tcW w:type="dxa" w:w="3088"/>
             <w:tcBorders>
               <w:top w:val="single" w:color="C9D2DE" w:sz="4"/>
               <w:left w:val="single" w:color="C9D2DE" w:sz="4"/>
@@ -1106,14 +1287,14 @@
         </w:trPr>
         <w:tc>
           <w:tcPr>
-            <w:tcW w:type="dxa" w:w="1600"/>
-            <w:tcBorders>
-              <w:top w:val="single" w:color="C9D2DE" w:sz="4"/>
-              <w:left w:val="single" w:color="C9D2DE" w:sz="4"/>
-              <w:bottom w:val="single" w:color="C9D2DE" w:sz="4"/>
-              <w:right w:val="single" w:color="C9D2DE" w:sz="4"/>
-            </w:tcBorders>
-            <w:shd w:fill="DCE6F2" w:color="auto" w:val="clear"/>
+            <w:tcW w:type="dxa" w:w="1300"/>
+            <w:tcBorders>
+              <w:top w:val="single" w:color="C9D2DE" w:sz="4"/>
+              <w:left w:val="single" w:color="C9D2DE" w:sz="4"/>
+              <w:bottom w:val="single" w:color="C9D2DE" w:sz="4"/>
+              <w:right w:val="single" w:color="C9D2DE" w:sz="4"/>
+            </w:tcBorders>
+            <w:shd w:fill="F7F9FC" w:color="auto" w:val="clear"/>
             <w:tcMar>
               <w:top w:type="dxa" w:w="70"/>
               <w:left w:type="dxa" w:w="100"/>
@@ -1135,13 +1316,216 @@
                 <w:sz w:val="17"/>
                 <w:szCs w:val="17"/>
               </w:rPr>
-              <w:t xml:space="preserve">Total peserta</w:t>
-            </w:r>
-          </w:p>
-        </w:tc>
-        <w:tc>
-          <w:tcPr>
-            <w:tcW w:type="dxa" w:w="1000"/>
+              <w:t xml:space="preserve">D. Jaringan pendukung</w:t>
+            </w:r>
+          </w:p>
+        </w:tc>
+        <w:tc>
+          <w:tcPr>
+            <w:tcW w:type="dxa" w:w="1700"/>
+            <w:tcBorders>
+              <w:top w:val="single" w:color="C9D2DE" w:sz="4"/>
+              <w:left w:val="single" w:color="C9D2DE" w:sz="4"/>
+              <w:bottom w:val="single" w:color="C9D2DE" w:sz="4"/>
+              <w:right w:val="single" w:color="C9D2DE" w:sz="4"/>
+            </w:tcBorders>
+            <w:shd w:fill="F7F9FC" w:color="auto" w:val="clear"/>
+            <w:tcMar>
+              <w:top w:type="dxa" w:w="70"/>
+              <w:left w:type="dxa" w:w="100"/>
+              <w:bottom w:type="dxa" w:w="70"/>
+              <w:right w:type="dxa" w:w="100"/>
+            </w:tcMar>
+            <w:vAlign w:val="top"/>
+          </w:tcPr>
+          <w:p>
+            <w:pPr>
+              <w:spacing w:after="30" w:line="260"/>
+              <w:jc w:val="left"/>
+            </w:pPr>
+            <w:r>
+              <w:rPr>
+                <w:color w:val="1D1D1F"/>
+                <w:sz w:val="17"/>
+                <w:szCs w:val="17"/>
+              </w:rPr>
+              <w:t xml:space="preserve">KKG, komunitas, mitra</w:t>
+            </w:r>
+          </w:p>
+        </w:tc>
+        <w:tc>
+          <w:tcPr>
+            <w:tcW w:type="dxa" w:w="800"/>
+            <w:tcBorders>
+              <w:top w:val="single" w:color="C9D2DE" w:sz="4"/>
+              <w:left w:val="single" w:color="C9D2DE" w:sz="4"/>
+              <w:bottom w:val="single" w:color="C9D2DE" w:sz="4"/>
+              <w:right w:val="single" w:color="C9D2DE" w:sz="4"/>
+            </w:tcBorders>
+            <w:shd w:fill="F7F9FC" w:color="auto" w:val="clear"/>
+            <w:tcMar>
+              <w:top w:type="dxa" w:w="70"/>
+              <w:left w:type="dxa" w:w="100"/>
+              <w:bottom w:type="dxa" w:w="70"/>
+              <w:right w:type="dxa" w:w="100"/>
+            </w:tcMar>
+            <w:vAlign w:val="top"/>
+          </w:tcPr>
+          <w:p>
+            <w:pPr>
+              <w:spacing w:after="30" w:line="260"/>
+              <w:jc w:val="right"/>
+            </w:pPr>
+            <w:r>
+              <w:rPr>
+                <w:color w:val="1D1D1F"/>
+                <w:sz w:val="17"/>
+                <w:szCs w:val="17"/>
+              </w:rPr>
+              <w:t xml:space="preserve">-</w:t>
+            </w:r>
+          </w:p>
+        </w:tc>
+        <w:tc>
+          <w:tcPr>
+            <w:tcW w:type="dxa" w:w="1050"/>
+            <w:tcBorders>
+              <w:top w:val="single" w:color="C9D2DE" w:sz="4"/>
+              <w:left w:val="single" w:color="C9D2DE" w:sz="4"/>
+              <w:bottom w:val="single" w:color="C9D2DE" w:sz="4"/>
+              <w:right w:val="single" w:color="C9D2DE" w:sz="4"/>
+            </w:tcBorders>
+            <w:shd w:fill="F7F9FC" w:color="auto" w:val="clear"/>
+            <w:tcMar>
+              <w:top w:type="dxa" w:w="70"/>
+              <w:left w:type="dxa" w:w="100"/>
+              <w:bottom w:type="dxa" w:w="70"/>
+              <w:right w:type="dxa" w:w="100"/>
+            </w:tcMar>
+            <w:vAlign w:val="top"/>
+          </w:tcPr>
+          <w:p>
+            <w:pPr>
+              <w:spacing w:after="30" w:line="260"/>
+              <w:jc w:val="right"/>
+            </w:pPr>
+            <w:r>
+              <w:rPr>
+                <w:color w:val="1D1D1F"/>
+                <w:sz w:val="17"/>
+                <w:szCs w:val="17"/>
+              </w:rPr>
+              <w:t xml:space="preserve">-</w:t>
+            </w:r>
+          </w:p>
+        </w:tc>
+        <w:tc>
+          <w:tcPr>
+            <w:tcW w:type="dxa" w:w="800"/>
+            <w:tcBorders>
+              <w:top w:val="single" w:color="C9D2DE" w:sz="4"/>
+              <w:left w:val="single" w:color="C9D2DE" w:sz="4"/>
+              <w:bottom w:val="single" w:color="C9D2DE" w:sz="4"/>
+              <w:right w:val="single" w:color="C9D2DE" w:sz="4"/>
+            </w:tcBorders>
+            <w:shd w:fill="F7F9FC" w:color="auto" w:val="clear"/>
+            <w:tcMar>
+              <w:top w:type="dxa" w:w="70"/>
+              <w:left w:type="dxa" w:w="100"/>
+              <w:bottom w:type="dxa" w:w="70"/>
+              <w:right w:type="dxa" w:w="100"/>
+            </w:tcMar>
+            <w:vAlign w:val="top"/>
+          </w:tcPr>
+          <w:p>
+            <w:pPr>
+              <w:spacing w:after="30" w:line="260"/>
+              <w:jc w:val="right"/>
+            </w:pPr>
+            <w:r>
+              <w:rPr>
+                <w:color w:val="1D1D1F"/>
+                <w:sz w:val="17"/>
+                <w:szCs w:val="17"/>
+              </w:rPr>
+              <w:t xml:space="preserve">-</w:t>
+            </w:r>
+          </w:p>
+        </w:tc>
+        <w:tc>
+          <w:tcPr>
+            <w:tcW w:type="dxa" w:w="900"/>
+            <w:tcBorders>
+              <w:top w:val="single" w:color="C9D2DE" w:sz="4"/>
+              <w:left w:val="single" w:color="C9D2DE" w:sz="4"/>
+              <w:bottom w:val="single" w:color="C9D2DE" w:sz="4"/>
+              <w:right w:val="single" w:color="C9D2DE" w:sz="4"/>
+            </w:tcBorders>
+            <w:shd w:fill="F7F9FC" w:color="auto" w:val="clear"/>
+            <w:tcMar>
+              <w:top w:type="dxa" w:w="70"/>
+              <w:left w:type="dxa" w:w="100"/>
+              <w:bottom w:type="dxa" w:w="70"/>
+              <w:right w:type="dxa" w:w="100"/>
+            </w:tcMar>
+            <w:vAlign w:val="top"/>
+          </w:tcPr>
+          <w:p>
+            <w:pPr>
+              <w:spacing w:after="30" w:line="260"/>
+              <w:jc w:val="right"/>
+            </w:pPr>
+            <w:r>
+              <w:rPr>
+                <w:color w:val="1D1D1F"/>
+                <w:sz w:val="17"/>
+                <w:szCs w:val="17"/>
+              </w:rPr>
+              <w:t xml:space="preserve">Tanpa kuota</w:t>
+            </w:r>
+          </w:p>
+        </w:tc>
+        <w:tc>
+          <w:tcPr>
+            <w:tcW w:type="dxa" w:w="3088"/>
+            <w:tcBorders>
+              <w:top w:val="single" w:color="C9D2DE" w:sz="4"/>
+              <w:left w:val="single" w:color="C9D2DE" w:sz="4"/>
+              <w:bottom w:val="single" w:color="C9D2DE" w:sz="4"/>
+              <w:right w:val="single" w:color="C9D2DE" w:sz="4"/>
+            </w:tcBorders>
+            <w:shd w:fill="F7F9FC" w:color="auto" w:val="clear"/>
+            <w:tcMar>
+              <w:top w:type="dxa" w:w="70"/>
+              <w:left w:type="dxa" w:w="100"/>
+              <w:bottom w:type="dxa" w:w="70"/>
+              <w:right w:type="dxa" w:w="100"/>
+            </w:tcMar>
+            <w:vAlign w:val="top"/>
+          </w:tcPr>
+          <w:p>
+            <w:pPr>
+              <w:spacing w:after="30" w:line="260"/>
+              <w:jc w:val="left"/>
+            </w:pPr>
+            <w:r>
+              <w:rPr>
+                <w:color w:val="1D1D1F"/>
+                <w:sz w:val="17"/>
+                <w:szCs w:val="17"/>
+              </w:rPr>
+              <w:t xml:space="preserve">Membantu menyebarkan undangan dan menjadi mitra (2.3.5).</w:t>
+            </w:r>
+          </w:p>
+        </w:tc>
+      </w:tr>
+      <w:tr>
+        <w:trPr>
+          <w:cantSplit/>
+        </w:trPr>
+        <w:tc>
+          <w:tcPr>
+            <w:tcW w:type="dxa" w:w="1300"/>
             <w:tcBorders>
               <w:top w:val="single" w:color="C9D2DE" w:sz="4"/>
               <w:left w:val="single" w:color="C9D2DE" w:sz="4"/>
@@ -1161,81 +1545,6 @@
             <w:pPr>
               <w:spacing w:after="30" w:line="260"/>
               <w:jc w:val="left"/>
-            </w:pPr>
-          </w:p>
-        </w:tc>
-        <w:tc>
-          <w:tcPr>
-            <w:tcW w:type="dxa" w:w="1200"/>
-            <w:tcBorders>
-              <w:top w:val="single" w:color="C9D2DE" w:sz="4"/>
-              <w:left w:val="single" w:color="C9D2DE" w:sz="4"/>
-              <w:bottom w:val="single" w:color="C9D2DE" w:sz="4"/>
-              <w:right w:val="single" w:color="C9D2DE" w:sz="4"/>
-            </w:tcBorders>
-            <w:shd w:fill="DCE6F2" w:color="auto" w:val="clear"/>
-            <w:tcMar>
-              <w:top w:type="dxa" w:w="70"/>
-              <w:left w:type="dxa" w:w="100"/>
-              <w:bottom w:type="dxa" w:w="70"/>
-              <w:right w:type="dxa" w:w="100"/>
-            </w:tcMar>
-            <w:vAlign w:val="top"/>
-          </w:tcPr>
-          <w:p>
-            <w:pPr>
-              <w:spacing w:after="30" w:line="260"/>
-              <w:jc w:val="right"/>
-            </w:pPr>
-          </w:p>
-        </w:tc>
-        <w:tc>
-          <w:tcPr>
-            <w:tcW w:type="dxa" w:w="1100"/>
-            <w:tcBorders>
-              <w:top w:val="single" w:color="C9D2DE" w:sz="4"/>
-              <w:left w:val="single" w:color="C9D2DE" w:sz="4"/>
-              <w:bottom w:val="single" w:color="C9D2DE" w:sz="4"/>
-              <w:right w:val="single" w:color="C9D2DE" w:sz="4"/>
-            </w:tcBorders>
-            <w:shd w:fill="DCE6F2" w:color="auto" w:val="clear"/>
-            <w:tcMar>
-              <w:top w:type="dxa" w:w="70"/>
-              <w:left w:type="dxa" w:w="100"/>
-              <w:bottom w:type="dxa" w:w="70"/>
-              <w:right w:type="dxa" w:w="100"/>
-            </w:tcMar>
-            <w:vAlign w:val="top"/>
-          </w:tcPr>
-          <w:p>
-            <w:pPr>
-              <w:spacing w:after="30" w:line="260"/>
-              <w:jc w:val="right"/>
-            </w:pPr>
-          </w:p>
-        </w:tc>
-        <w:tc>
-          <w:tcPr>
-            <w:tcW w:type="dxa" w:w="900"/>
-            <w:tcBorders>
-              <w:top w:val="single" w:color="C9D2DE" w:sz="4"/>
-              <w:left w:val="single" w:color="C9D2DE" w:sz="4"/>
-              <w:bottom w:val="single" w:color="C9D2DE" w:sz="4"/>
-              <w:right w:val="single" w:color="C9D2DE" w:sz="4"/>
-            </w:tcBorders>
-            <w:shd w:fill="DCE6F2" w:color="auto" w:val="clear"/>
-            <w:tcMar>
-              <w:top w:type="dxa" w:w="70"/>
-              <w:left w:type="dxa" w:w="100"/>
-              <w:bottom w:type="dxa" w:w="70"/>
-              <w:right w:type="dxa" w:w="100"/>
-            </w:tcMar>
-            <w:vAlign w:val="top"/>
-          </w:tcPr>
-          <w:p>
-            <w:pPr>
-              <w:spacing w:after="30" w:line="260"/>
-              <w:jc w:val="right"/>
             </w:pPr>
             <w:r>
               <w:rPr>
@@ -1245,13 +1554,148 @@
                 <w:sz w:val="17"/>
                 <w:szCs w:val="17"/>
               </w:rPr>
+              <w:t xml:space="preserve">Total peserta</w:t>
+            </w:r>
+          </w:p>
+        </w:tc>
+        <w:tc>
+          <w:tcPr>
+            <w:tcW w:type="dxa" w:w="1700"/>
+            <w:tcBorders>
+              <w:top w:val="single" w:color="C9D2DE" w:sz="4"/>
+              <w:left w:val="single" w:color="C9D2DE" w:sz="4"/>
+              <w:bottom w:val="single" w:color="C9D2DE" w:sz="4"/>
+              <w:right w:val="single" w:color="C9D2DE" w:sz="4"/>
+            </w:tcBorders>
+            <w:shd w:fill="DCE6F2" w:color="auto" w:val="clear"/>
+            <w:tcMar>
+              <w:top w:type="dxa" w:w="70"/>
+              <w:left w:type="dxa" w:w="100"/>
+              <w:bottom w:type="dxa" w:w="70"/>
+              <w:right w:type="dxa" w:w="100"/>
+            </w:tcMar>
+            <w:vAlign w:val="top"/>
+          </w:tcPr>
+          <w:p>
+            <w:pPr>
+              <w:spacing w:after="30" w:line="260"/>
+              <w:jc w:val="left"/>
+            </w:pPr>
+          </w:p>
+        </w:tc>
+        <w:tc>
+          <w:tcPr>
+            <w:tcW w:type="dxa" w:w="800"/>
+            <w:tcBorders>
+              <w:top w:val="single" w:color="C9D2DE" w:sz="4"/>
+              <w:left w:val="single" w:color="C9D2DE" w:sz="4"/>
+              <w:bottom w:val="single" w:color="C9D2DE" w:sz="4"/>
+              <w:right w:val="single" w:color="C9D2DE" w:sz="4"/>
+            </w:tcBorders>
+            <w:shd w:fill="DCE6F2" w:color="auto" w:val="clear"/>
+            <w:tcMar>
+              <w:top w:type="dxa" w:w="70"/>
+              <w:left w:type="dxa" w:w="100"/>
+              <w:bottom w:type="dxa" w:w="70"/>
+              <w:right w:type="dxa" w:w="100"/>
+            </w:tcMar>
+            <w:vAlign w:val="top"/>
+          </w:tcPr>
+          <w:p>
+            <w:pPr>
+              <w:spacing w:after="30" w:line="260"/>
+              <w:jc w:val="right"/>
+            </w:pPr>
+          </w:p>
+        </w:tc>
+        <w:tc>
+          <w:tcPr>
+            <w:tcW w:type="dxa" w:w="1050"/>
+            <w:tcBorders>
+              <w:top w:val="single" w:color="C9D2DE" w:sz="4"/>
+              <w:left w:val="single" w:color="C9D2DE" w:sz="4"/>
+              <w:bottom w:val="single" w:color="C9D2DE" w:sz="4"/>
+              <w:right w:val="single" w:color="C9D2DE" w:sz="4"/>
+            </w:tcBorders>
+            <w:shd w:fill="DCE6F2" w:color="auto" w:val="clear"/>
+            <w:tcMar>
+              <w:top w:type="dxa" w:w="70"/>
+              <w:left w:type="dxa" w:w="100"/>
+              <w:bottom w:type="dxa" w:w="70"/>
+              <w:right w:type="dxa" w:w="100"/>
+            </w:tcMar>
+            <w:vAlign w:val="top"/>
+          </w:tcPr>
+          <w:p>
+            <w:pPr>
+              <w:spacing w:after="30" w:line="260"/>
+              <w:jc w:val="right"/>
+            </w:pPr>
+          </w:p>
+        </w:tc>
+        <w:tc>
+          <w:tcPr>
+            <w:tcW w:type="dxa" w:w="800"/>
+            <w:tcBorders>
+              <w:top w:val="single" w:color="C9D2DE" w:sz="4"/>
+              <w:left w:val="single" w:color="C9D2DE" w:sz="4"/>
+              <w:bottom w:val="single" w:color="C9D2DE" w:sz="4"/>
+              <w:right w:val="single" w:color="C9D2DE" w:sz="4"/>
+            </w:tcBorders>
+            <w:shd w:fill="DCE6F2" w:color="auto" w:val="clear"/>
+            <w:tcMar>
+              <w:top w:type="dxa" w:w="70"/>
+              <w:left w:type="dxa" w:w="100"/>
+              <w:bottom w:type="dxa" w:w="70"/>
+              <w:right w:type="dxa" w:w="100"/>
+            </w:tcMar>
+            <w:vAlign w:val="top"/>
+          </w:tcPr>
+          <w:p>
+            <w:pPr>
+              <w:spacing w:after="30" w:line="260"/>
+              <w:jc w:val="right"/>
+            </w:pPr>
+          </w:p>
+        </w:tc>
+        <w:tc>
+          <w:tcPr>
+            <w:tcW w:type="dxa" w:w="900"/>
+            <w:tcBorders>
+              <w:top w:val="single" w:color="C9D2DE" w:sz="4"/>
+              <w:left w:val="single" w:color="C9D2DE" w:sz="4"/>
+              <w:bottom w:val="single" w:color="C9D2DE" w:sz="4"/>
+              <w:right w:val="single" w:color="C9D2DE" w:sz="4"/>
+            </w:tcBorders>
+            <w:shd w:fill="DCE6F2" w:color="auto" w:val="clear"/>
+            <w:tcMar>
+              <w:top w:type="dxa" w:w="70"/>
+              <w:left w:type="dxa" w:w="100"/>
+              <w:bottom w:type="dxa" w:w="70"/>
+              <w:right w:type="dxa" w:w="100"/>
+            </w:tcMar>
+            <w:vAlign w:val="top"/>
+          </w:tcPr>
+          <w:p>
+            <w:pPr>
+              <w:spacing w:after="30" w:line="260"/>
+              <w:jc w:val="right"/>
+            </w:pPr>
+            <w:r>
+              <w:rPr>
+                <w:b/>
+                <w:bCs/>
+                <w:color w:val="1D1D1F"/>
+                <w:sz w:val="17"/>
+                <w:szCs w:val="17"/>
+              </w:rPr>
               <w:t xml:space="preserve">80</w:t>
             </w:r>
           </w:p>
         </w:tc>
         <w:tc>
           <w:tcPr>
-            <w:tcW w:type="dxa" w:w="3838"/>
+            <w:tcW w:type="dxa" w:w="3088"/>
             <w:tcBorders>
               <w:top w:val="single" w:color="C9D2DE" w:sz="4"/>
               <w:left w:val="single" w:color="C9D2DE" w:sz="4"/>
@@ -1286,7 +1730,7 @@
           <w:sz w:val="16"/>
           <w:szCs w:val="16"/>
         </w:rPr>
-        <w:t xml:space="preserve">Kuota adalah usulan Sanggabiz dan dapat disesuaikan dengan permintaan klien. Kategori E (jaringan pendukung, 2.3.5) tidak memiliki kuota. Jumlah guru dan siswa: portal Sekolah Kita, Kemendikdasmen, semester 2026/2027 Gasal [21].</w:t>
+        <w:t xml:space="preserve">Jumlah guru diundang adalah usulan Sanggabiz dan dapat disesuaikan dengan permintaan klien. Sekolah menunjuk sendiri gurunya. Jumlah guru dan siswa: portal Sekolah Kita, Kemendikdasmen, semester 2026/2027 Gasal [21].</w:t>
       </w:r>
     </w:p>
     <w:p>
@@ -1302,7 +1746,7 @@
           <w:sz w:val="20"/>
           <w:szCs w:val="20"/>
         </w:rPr>
-        <w:t xml:space="preserve">2.3.2 Kategori A dan B: empat SLB di Kota Balikpapan</w:t>
+        <w:t xml:space="preserve">2.3.2 Kategori A: empat SLB di Kota Balikpapan</w:t>
       </w:r>
     </w:p>
     <w:p>
@@ -1311,7 +1755,7 @@
         <w:jc w:val="left"/>
       </w:pPr>
       <w:r>
-        <w:t xml:space="preserve">Referensi Kemendikdasmen mencatat empat SLB di Balikpapan, dua di Kecamatan Balikpapan Selatan dan dua di Kecamatan Balikpapan Kota [16]. Seluruhnya kami undang. Kuota tiap sekolah sekitar separuh dari gurunya agar kegiatan belajar di sekolah tetap berjalan.</w:t>
+        <w:t xml:space="preserve">Referensi Kemendikdasmen mencatat empat SLB di Balikpapan, dua di Kecamatan Balikpapan Selatan dan dua di Kecamatan Balikpapan Kota [16]. Seluruhnya kami undang. Jumlah guru yang diundang dari tiap sekolah sekitar separuh dari gurunya, agar kegiatan belajar di sekolah tetap berjalan.</w:t>
       </w:r>
     </w:p>
     <w:tbl>
@@ -1581,7 +2025,7 @@
                 <w:sz w:val="16"/>
                 <w:szCs w:val="16"/>
               </w:rPr>
-              <w:t xml:space="preserve">Kuota</w:t>
+              <w:t xml:space="preserve">Guru diundang</w:t>
             </w:r>
           </w:p>
         </w:tc>
@@ -2977,7 +3421,7 @@
           <w:sz w:val="20"/>
           <w:szCs w:val="20"/>
         </w:rPr>
-        <w:t xml:space="preserve">2.3.3 Kategori C: SD dan SMP inklusif</w:t>
+        <w:t xml:space="preserve">2.3.3 Kategori B: SD dan SMP inklusif</w:t>
       </w:r>
     </w:p>
     <w:p>
@@ -3230,7 +3674,7 @@
                 <w:sz w:val="16"/>
                 <w:szCs w:val="16"/>
               </w:rPr>
-              <w:t xml:space="preserve">Kuota</w:t>
+              <w:t xml:space="preserve">Guru diundang</w:t>
             </w:r>
           </w:p>
         </w:tc>
@@ -7103,7 +7547,7 @@
           <w:sz w:val="20"/>
           <w:szCs w:val="20"/>
         </w:rPr>
-        <w:t xml:space="preserve">2.3.4 Kategori D: SMA dan SMK inklusif</w:t>
+        <w:t xml:space="preserve">2.3.4 Kategori C: SMA dan SMK inklusif</w:t>
       </w:r>
     </w:p>
     <w:p>
@@ -7347,7 +7791,7 @@
                 <w:sz w:val="16"/>
                 <w:szCs w:val="16"/>
               </w:rPr>
-              <w:t xml:space="preserve">Kuota</w:t>
+              <w:t xml:space="preserve">Guru diundang</w:t>
             </w:r>
           </w:p>
         </w:tc>
@@ -9734,7 +10178,7 @@
           <w:sz w:val="20"/>
           <w:szCs w:val="20"/>
         </w:rPr>
-        <w:t xml:space="preserve">2.3.5 Kategori E: jaringan pendukung</w:t>
+        <w:t xml:space="preserve">2.3.5 Kategori D: jaringan pendukung</w:t>
       </w:r>
     </w:p>
     <w:p>
@@ -9743,7 +10187,7 @@
         <w:jc w:val="left"/>
       </w:pPr>
       <w:r>
-        <w:t xml:space="preserve">Kategori ini tidak dihitung sebagai kuota. Mereka membantu undangan dan menjadi mitra bila klien menghendaki.</w:t>
+        <w:t xml:space="preserve">Kategori ini tidak memiliki kuota. Mereka membantu undangan dan menjadi mitra bila klien menghendaki.</w:t>
       </w:r>
     </w:p>
     <w:p>
@@ -10164,7 +10608,7 @@
                 <w:sz w:val="17"/>
                 <w:szCs w:val="17"/>
               </w:rPr>
-              <w:t xml:space="preserve">Rekomendasi dan undangan untuk kategori A, B, dan D</w:t>
+              <w:t xml:space="preserve">Rekomendasi dan undangan untuk kategori A dan C</w:t>
             </w:r>
           </w:p>
         </w:tc>
@@ -10317,7 +10761,7 @@
                 <w:sz w:val="17"/>
                 <w:szCs w:val="17"/>
               </w:rPr>
-              <w:t xml:space="preserve">Rekomendasi, daftar sekolah, dan undangan untuk kategori C</w:t>
+              <w:t xml:space="preserve">Rekomendasi, daftar sekolah, dan undangan untuk kategori B</w:t>
             </w:r>
           </w:p>
         </w:tc>
@@ -10384,7 +10828,7 @@
         <w:spacing w:after="70" w:line="290"/>
       </w:pPr>
       <w:r>
-        <w:t xml:space="preserve">undangan resmi kepada kepala sekolah di kategori A sampai D. Tiap sekolah menunjuk guru yang memegang kelas dengan murid berkebutuhan khusus, dan GPK diprioritaskan,</w:t>
+        <w:t xml:space="preserve">undangan resmi kepada kepala sekolah di kategori A sampai C. Tiap sekolah menunjuk guru yang memegang kelas dengan murid berkebutuhan khusus, dan GPK diprioritaskan,</w:t>
       </w:r>
     </w:p>
     <w:p>
@@ -10397,7 +10841,7 @@
         <w:spacing w:after="70" w:line="290"/>
       </w:pPr>
       <w:r>
-        <w:t xml:space="preserve">kelompok kerja guru dan musyawarah kerja kepala sekolah (KKG dan MKKS), serta jaringan pada kategori E,</w:t>
+        <w:t xml:space="preserve">kelompok kerja guru dan musyawarah kerja kepala sekolah (KKG dan MKKS), serta jaringan pada kategori D,</w:t>
       </w:r>
     </w:p>
     <w:p>

</xml_diff>